<commit_message>
Generate methylation-aware documentation binaries
</commit_message>
<xml_diff>
--- a/manuscript/RSES_Onco_intro_methods_draft_v0110.docx
+++ b/manuscript/RSES_Onco_intro_methods_draft_v0110.docx
@@ -7,10 +7,10 @@
         <w:pStyle w:val="Title"/>
       </w:pPr>
       <w:r>
-        <w:t xml:space="preserve">RSES-Onco Introduction and Materials and Methods</w:t>
-      </w:r>
-    </w:p>
-    <w:bookmarkStart w:id="43" w:name="Xc52996e12672c7d5318e9a4fcd2f7b2a4351fe7"/>
+        <w:t xml:space="preserve">RSES-Onco Introduction and Materials and Methods v0.11.1</w:t>
+      </w:r>
+    </w:p>
+    <w:bookmarkStart w:id="45" w:name="Xc52996e12672c7d5318e9a4fcd2f7b2a4351fe7"/>
     <w:p>
       <w:pPr>
         <w:pStyle w:val="Heading1"/>
@@ -2787,8 +2787,154 @@
         <w:t xml:space="preserve">. 1995;57:289-300.</w:t>
       </w:r>
     </w:p>
+    <w:p>
+      <w:r>
+        <w:pict>
+          <v:rect style="width:0;height:1.5pt" o:hralign="center" o:hrstd="t" o:hr="t"/>
+        </w:pict>
+      </w:r>
+    </w:p>
     <w:bookmarkEnd w:id="42"/>
+    <w:bookmarkStart w:id="44" w:name="promoter-methylation-analysis"/>
+    <w:p>
+      <w:pPr>
+        <w:pStyle w:val="Heading2"/>
+      </w:pPr>
+      <w:r>
+        <w:t xml:space="preserve">Promoter methylation analysis</w:t>
+      </w:r>
+    </w:p>
+    <w:p>
+      <w:pPr>
+        <w:pStyle w:val="FirstParagraph"/>
+      </w:pPr>
+      <w:r>
+        <w:t xml:space="preserve">To incorporate epigenetic context without creating an independent evidence domain, open primary-tumor DNA methylation beta-value files were queried from the NCI Genomic Data Commons for TCGA-COAD, TCGA-READ, TCGA-STAD, TCGA-LUAD and TCGA-LUSC. The analysis used GDC-harmonized SeSAMe methylation-array outputs and the official GDC GENCODE-v36 probe annotations for HM27, HM450 and EPIC arrays.</w:t>
+      </w:r>
+    </w:p>
+    <w:p>
+      <w:pPr>
+        <w:pStyle w:val="BodyText"/>
+      </w:pPr>
+      <w:r>
+        <w:t xml:space="preserve">Promoter-associated probes were defined using the official annotation as probes located from 2 kb upstream to 500 bp downstream of a transcription start site or classified in promoter/TSS-related groups. Masked probes were removed when the GDC general-mask field was available. Promoter methylation for each gene and sample was represented by the median beta-value across retained promoter probes.</w:t>
+      </w:r>
+    </w:p>
+    <w:p>
+      <w:pPr>
+        <w:pStyle w:val="BodyText"/>
+      </w:pPr>
+      <w:r>
+        <w:t xml:space="preserve">For each directional candidate pair and cancer context, promoter beta-values for the hypothesized lost gene and target/paralog were matched within samples. Analyses required at least 10 paired samples. The workflow calculated median beta-values, median paired delta beta, Spearman correlation, a one-sided paired Wilcoxon test and Benjamini-Hochberg-adjusted P values. The directional promoter-methylation context score was defined as the median promoter beta of the hypothesized lost gene multiplied by one minus the median promoter beta of the target gene.</w:t>
+      </w:r>
+    </w:p>
+    <w:p>
+      <w:pPr>
+        <w:pStyle w:val="BodyText"/>
+      </w:pPr>
+      <w:r>
+        <w:t xml:space="preserve">Promoter methylation was integrated inside the existing expression-compensation domain. The global expression-compensation weight remained 0.08, while its internal subweights were 0.70 for event-stratified expression compensation and 0.30 for promoter methylation context. The internal score was coverage-adjusted, so missing methylation reduced subcoverage but was not interpreted as biological zero. GDC methylation was applied only to the integrated TCGA-DepMap ranking and not to the DepMap-only ranking. Methylation beta-values were treated as epigenetic context and not as direct proof of gene silencing.</w:t>
+      </w:r>
+    </w:p>
+    <w:bookmarkStart w:id="43" w:name="methylation-references"/>
+    <w:p>
+      <w:pPr>
+        <w:pStyle w:val="Heading3"/>
+      </w:pPr>
+      <w:r>
+        <w:t xml:space="preserve">Methylation references</w:t>
+      </w:r>
+    </w:p>
+    <w:p>
+      <w:pPr>
+        <w:numPr>
+          <w:ilvl w:val="0"/>
+          <w:numId w:val="1002"/>
+        </w:numPr>
+        <w:pStyle w:val="Compact"/>
+      </w:pPr>
+      <w:r>
+        <w:t xml:space="preserve">National Cancer Institute. Genomic Data Commons DNA methylation array harmonization documentation.</w:t>
+      </w:r>
+    </w:p>
+    <w:p>
+      <w:pPr>
+        <w:numPr>
+          <w:ilvl w:val="0"/>
+          <w:numId w:val="1002"/>
+        </w:numPr>
+        <w:pStyle w:val="Compact"/>
+      </w:pPr>
+      <w:r>
+        <w:t xml:space="preserve">Zhou W, Triche TJ Jr, Laird PW, Shen H. SeSAMe: reducing artifactual detection of DNA methylation by Infinium BeadChips in genomic deletions.</w:t>
+      </w:r>
+      <w:r>
+        <w:t xml:space="preserve"> </w:t>
+      </w:r>
+      <w:r>
+        <w:rPr>
+          <w:iCs/>
+          <w:i/>
+        </w:rPr>
+        <w:t xml:space="preserve">Nucleic Acids Research</w:t>
+      </w:r>
+      <w:r>
+        <w:t xml:space="preserve">. 2018;46:e123.</w:t>
+      </w:r>
+    </w:p>
+    <w:p>
+      <w:pPr>
+        <w:numPr>
+          <w:ilvl w:val="0"/>
+          <w:numId w:val="1002"/>
+        </w:numPr>
+        <w:pStyle w:val="Compact"/>
+      </w:pPr>
+      <w:r>
+        <w:t xml:space="preserve">Bibikova M, Barnes B, Tsan C, et al. High density DNA methylation array with single CpG site resolution.</w:t>
+      </w:r>
+      <w:r>
+        <w:t xml:space="preserve"> </w:t>
+      </w:r>
+      <w:r>
+        <w:rPr>
+          <w:iCs/>
+          <w:i/>
+        </w:rPr>
+        <w:t xml:space="preserve">Genomics</w:t>
+      </w:r>
+      <w:r>
+        <w:t xml:space="preserve">. 2011;98:288-295.</w:t>
+      </w:r>
+    </w:p>
+    <w:p>
+      <w:pPr>
+        <w:numPr>
+          <w:ilvl w:val="0"/>
+          <w:numId w:val="1002"/>
+        </w:numPr>
+        <w:pStyle w:val="Compact"/>
+      </w:pPr>
+      <w:r>
+        <w:t xml:space="preserve">Moran S, Arribas C, Esteller M. Validation of a DNA methylation microarray for 850,000 CpG sites of the human genome enriched in enhancer sequences.</w:t>
+      </w:r>
+      <w:r>
+        <w:t xml:space="preserve"> </w:t>
+      </w:r>
+      <w:r>
+        <w:rPr>
+          <w:iCs/>
+          <w:i/>
+        </w:rPr>
+        <w:t xml:space="preserve">Epigenomics</w:t>
+      </w:r>
+      <w:r>
+        <w:t xml:space="preserve">. 2016;8:389-399.</w:t>
+      </w:r>
+    </w:p>
     <w:bookmarkEnd w:id="43"/>
+    <w:bookmarkEnd w:id="44"/>
+    <w:bookmarkEnd w:id="45"/>
     <w:sectPr/>
   </w:body>
 </w:document>
@@ -2984,6 +3130,36 @@
     <w:abstractNumId w:val="990"/>
   </w:num>
   <w:num w:numId="1001">
+    <w:abstractNumId w:val="99411"/>
+    <w:lvlOverride w:ilvl="0">
+      <w:startOverride w:val="1"/>
+    </w:lvlOverride>
+    <w:lvlOverride w:ilvl="1">
+      <w:startOverride w:val="1"/>
+    </w:lvlOverride>
+    <w:lvlOverride w:ilvl="2">
+      <w:startOverride w:val="1"/>
+    </w:lvlOverride>
+    <w:lvlOverride w:ilvl="3">
+      <w:startOverride w:val="1"/>
+    </w:lvlOverride>
+    <w:lvlOverride w:ilvl="4">
+      <w:startOverride w:val="1"/>
+    </w:lvlOverride>
+    <w:lvlOverride w:ilvl="5">
+      <w:startOverride w:val="1"/>
+    </w:lvlOverride>
+    <w:lvlOverride w:ilvl="6">
+      <w:startOverride w:val="1"/>
+    </w:lvlOverride>
+    <w:lvlOverride w:ilvl="7">
+      <w:startOverride w:val="1"/>
+    </w:lvlOverride>
+    <w:lvlOverride w:ilvl="8">
+      <w:startOverride w:val="1"/>
+    </w:lvlOverride>
+  </w:num>
+  <w:num w:numId="1002">
     <w:abstractNumId w:val="99411"/>
     <w:lvlOverride w:ilvl="0">
       <w:startOverride w:val="1"/>

</xml_diff>

<commit_message>
Generate methylation-aware documentation sources and binaries
</commit_message>
<xml_diff>
--- a/manuscript/RSES_Onco_intro_methods_draft_v0110.docx
+++ b/manuscript/RSES_Onco_intro_methods_draft_v0110.docx
@@ -10,7 +10,7 @@
         <w:t xml:space="preserve">RSES-Onco Introduction and Materials and Methods v0.11.1</w:t>
       </w:r>
     </w:p>
-    <w:bookmarkStart w:id="45" w:name="Xc52996e12672c7d5318e9a4fcd2f7b2a4351fe7"/>
+    <w:bookmarkStart w:id="46" w:name="Xc52996e12672c7d5318e9a4fcd2f7b2a4351fe7"/>
     <w:p>
       <w:pPr>
         <w:pStyle w:val="Heading1"/>
@@ -2787,15 +2787,8 @@
         <w:t xml:space="preserve">. 1995;57:289-300.</w:t>
       </w:r>
     </w:p>
-    <w:p>
-      <w:r>
-        <w:pict>
-          <v:rect style="width:0;height:1.5pt" o:hralign="center" o:hrstd="t" o:hr="t"/>
-        </w:pict>
-      </w:r>
-    </w:p>
     <w:bookmarkEnd w:id="42"/>
-    <w:bookmarkStart w:id="44" w:name="promoter-methylation-analysis"/>
+    <w:bookmarkStart w:id="43" w:name="promoter-methylation-analysis"/>
     <w:p>
       <w:pPr>
         <w:pStyle w:val="Heading2"/>
@@ -2804,6 +2797,16 @@
         <w:t xml:space="preserve">Promoter methylation analysis</w:t>
       </w:r>
     </w:p>
+    <w:bookmarkEnd w:id="43"/>
+    <w:bookmarkStart w:id="45" w:name="promoter-methylation-analysis-1"/>
+    <w:p>
+      <w:pPr>
+        <w:pStyle w:val="Heading2"/>
+      </w:pPr>
+      <w:r>
+        <w:t xml:space="preserve">Promoter methylation analysis</w:t>
+      </w:r>
+    </w:p>
     <w:p>
       <w:pPr>
         <w:pStyle w:val="FirstParagraph"/>
@@ -2836,7 +2839,7 @@
         <w:t xml:space="preserve">Promoter methylation was integrated inside the existing expression-compensation domain. The global expression-compensation weight remained 0.08, while its internal subweights were 0.70 for event-stratified expression compensation and 0.30 for promoter methylation context. The internal score was coverage-adjusted, so missing methylation reduced subcoverage but was not interpreted as biological zero. GDC methylation was applied only to the integrated TCGA-DepMap ranking and not to the DepMap-only ranking. Methylation beta-values were treated as epigenetic context and not as direct proof of gene silencing.</w:t>
       </w:r>
     </w:p>
-    <w:bookmarkStart w:id="43" w:name="methylation-references"/>
+    <w:bookmarkStart w:id="44" w:name="methylation-references"/>
     <w:p>
       <w:pPr>
         <w:pStyle w:val="Heading3"/>
@@ -2932,9 +2935,9 @@
         <w:t xml:space="preserve">. 2016;8:389-399.</w:t>
       </w:r>
     </w:p>
-    <w:bookmarkEnd w:id="43"/>
     <w:bookmarkEnd w:id="44"/>
     <w:bookmarkEnd w:id="45"/>
+    <w:bookmarkEnd w:id="46"/>
     <w:sectPr/>
   </w:body>
 </w:document>

</xml_diff>

<commit_message>
Generate repository documentation binaries
</commit_message>
<xml_diff>
--- a/manuscript/RSES_Onco_intro_methods_draft_v0110.docx
+++ b/manuscript/RSES_Onco_intro_methods_draft_v0110.docx
@@ -7,10 +7,10 @@
         <w:pStyle w:val="Title"/>
       </w:pPr>
       <w:r>
-        <w:t xml:space="preserve">RSES-Onco Introduction and Materials and Methods</w:t>
-      </w:r>
-    </w:p>
-    <w:bookmarkStart w:id="43" w:name="Xc52996e12672c7d5318e9a4fcd2f7b2a4351fe7"/>
+        <w:t xml:space="preserve">RSES-Onco Introduction and Materials and Methods v0.11.1</w:t>
+      </w:r>
+    </w:p>
+    <w:bookmarkStart w:id="44" w:name="Xc52996e12672c7d5318e9a4fcd2f7b2a4351fe7"/>
     <w:p>
       <w:pPr>
         <w:pStyle w:val="Heading1"/>
@@ -2788,7 +2788,56 @@
       </w:r>
     </w:p>
     <w:bookmarkEnd w:id="42"/>
+    <w:bookmarkStart w:id="43" w:name="promoter-methylation-analysis"/>
+    <w:p>
+      <w:pPr>
+        <w:pStyle w:val="Heading2"/>
+      </w:pPr>
+      <w:r>
+        <w:t xml:space="preserve">Promoter methylation analysis</w:t>
+      </w:r>
+    </w:p>
+    <w:p>
+      <w:pPr>
+        <w:pStyle w:val="FirstParagraph"/>
+      </w:pPr>
+      <w:r>
+        <w:t xml:space="preserve">Promoter methylation was incorporated as an epigenetic subcomponent of the regulatory-network microniche domain. The analysis supported the DepMap</w:t>
+      </w:r>
+      <w:r>
+        <w:t xml:space="preserve"> </w:t>
+      </w:r>
+      <w:r>
+        <w:rPr>
+          <w:rStyle w:val="VerbatimChar"/>
+        </w:rPr>
+        <w:t xml:space="preserve">Methylation (1kb upstream TSS)</w:t>
+      </w:r>
+      <w:r>
+        <w:t xml:space="preserve"> </w:t>
+      </w:r>
+      <w:r>
+        <w:t xml:space="preserve">custom-download matrix and the historical CCLE RRBS TSS1kb matrix. Multiple promoter features assigned to the same gene were collapsed by the median within each model.</w:t>
+      </w:r>
+    </w:p>
+    <w:p>
+      <w:pPr>
+        <w:pStyle w:val="BodyText"/>
+      </w:pPr>
+      <w:r>
+        <w:t xml:space="preserve">For each candidate pair and cancer lineage, the analysis quantified divergence between the lost- and target-gene promoter-methylation profiles and tested whether target-promoter methylation was lower in models with loss of the origin gene than in intact models. The latter comparison used a Mann-Whitney U test, with Benjamini-Hochberg adjustment globally and within cancer context. The methylation context combined pair-profile divergence and conditional target hypomethylation with equal internal weights and explicit missing-data coverage.</w:t>
+      </w:r>
+    </w:p>
+    <w:p>
+      <w:pPr>
+        <w:pStyle w:val="BodyText"/>
+      </w:pPr>
+      <w:r>
+        <w:t xml:space="preserve">Methylation shared the existing regulatory-network domain with DoRothEA TF associations, TF-expression consistency and JASPAR/FIMO promoter-motif evidence. Its inclusion did not alter the seven top-level RSES-Onco weights. Promoter methylation was considered association evidence and not direct proof of transcriptional silencing or causal compensation.</w:t>
+      </w:r>
+    </w:p>
     <w:bookmarkEnd w:id="43"/>
+    <w:bookmarkEnd w:id="44"/>
     <w:sectPr/>
   </w:body>
 </w:document>

</xml_diff>

<commit_message>
Synchronize genomic Circos tutorials methods and documents
</commit_message>
<xml_diff>
--- a/manuscript/RSES_Onco_intro_methods_draft_v0110.docx
+++ b/manuscript/RSES_Onco_intro_methods_draft_v0110.docx
@@ -10,7 +10,7 @@
         <w:t xml:space="preserve">RSES-Onco Introduction and Materials and Methods v0.11.1</w:t>
       </w:r>
     </w:p>
-    <w:bookmarkStart w:id="44" w:name="Xc52996e12672c7d5318e9a4fcd2f7b2a4351fe7"/>
+    <w:bookmarkStart w:id="45" w:name="Xc52996e12672c7d5318e9a4fcd2f7b2a4351fe7"/>
     <w:p>
       <w:pPr>
         <w:pStyle w:val="Heading1"/>
@@ -2837,7 +2837,25 @@
       </w:r>
     </w:p>
     <w:bookmarkEnd w:id="43"/>
+    <w:bookmarkStart w:id="44" w:name="genomic-circos-visualization"/>
+    <w:p>
+      <w:pPr>
+        <w:pStyle w:val="Heading2"/>
+      </w:pPr>
+      <w:r>
+        <w:t xml:space="preserve">Genomic Circos visualization</w:t>
+      </w:r>
+    </w:p>
+    <w:p>
+      <w:pPr>
+        <w:pStyle w:val="FirstParagraph"/>
+      </w:pPr>
+      <w:r>
+        <w:t xml:space="preserve">A genomic Circos representation was generated to integrate chromosomal position, NISE/paralog relationships and every RSES-Onco evidence layer. Canonical Ensembl/GRCh38 positions were assigned only to coordinate-resolved genes. NISE and homologous-paralog links were displayed separately, while concentric rings summarized top-level score domains, functional-microniche domains, expression-network and regulatory subcomponents, promoter methylation and evidence coverage. Missing evidence was retained as missing and displayed using hollow markers. Complete model-level expression values and exact figure-source tables were exported as supplementary data.</w:t>
+      </w:r>
+    </w:p>
     <w:bookmarkEnd w:id="44"/>
+    <w:bookmarkEnd w:id="45"/>
     <w:sectPr/>
   </w:body>
 </w:document>

</xml_diff>